<commit_message>
Pin Liberation Sans in reference.docx to fix cross-platform pagination drift
Pandoc's default reference.docx points body/heading text at "Aptos" via the
docx theme, a Microsoft-only font absent from both macOS and Linux
LibreOffice. Each substituted a different fallback, which changed
line-wrapping and therefore page count between machines: 79 pages on a
local macOS build vs. 92 for the same source on the GitHub Actions Ubuntu
runner. Liberation Sans is bundled with LibreOffice itself on every
platform, so pinning it removes the substitution step (and its
divergence) entirely.
</commit_message>
<xml_diff>
--- a/pipeline/reference.docx
+++ b/pipeline/reference.docx
@@ -672,6 +672,9 @@
   <w:style w:type="paragraph" w:default="1" w:styleId="Normal">
     <w:name w:val="Normal"/>
     <w:qFormat/>
+    <w:rPr>
+      <w:rFonts w:ascii="Liberation Sans" w:hAnsi="Liberation Sans"/>
+    </w:rPr>
   </w:style>
   <w:style w:type="paragraph" w:styleId="BodyText">
     <w:name w:val="Body Text"/>
@@ -710,7 +713,7 @@
       <w:jc w:val="center"/>
     </w:pPr>
     <w:rPr>
-      <w:rFonts w:asciiTheme="majorHAnsi" w:eastAsiaTheme="majorEastAsia" w:hAnsiTheme="majorHAnsi" w:cstheme="majorBidi"/>
+      <w:rFonts w:asciiTheme="majorHAnsi" w:eastAsiaTheme="majorEastAsia" w:hAnsiTheme="majorHAnsi" w:cstheme="majorBidi" w:ascii="Liberation Sans" w:hAnsi="Liberation Sans"/>
       <w:color w:val="8B0000"/>
       <w:sz w:val="56"/>
       <w:szCs w:val="56"/>
@@ -845,7 +848,7 @@
       <w:outlineLvl w:val="0"/>
     </w:pPr>
     <w:rPr>
-      <w:rFonts w:asciiTheme="majorHAnsi" w:eastAsiaTheme="majorEastAsia" w:hAnsiTheme="majorHAnsi" w:cstheme="majorBidi"/>
+      <w:rFonts w:asciiTheme="majorHAnsi" w:eastAsiaTheme="majorEastAsia" w:hAnsiTheme="majorHAnsi" w:cstheme="majorBidi" w:ascii="Liberation Sans" w:hAnsi="Liberation Sans"/>
       <w:b/>
       <w:color w:val="8B0000"/>
       <w:sz w:val="48"/>
@@ -869,7 +872,7 @@
       <w:outlineLvl w:val="1"/>
     </w:pPr>
     <w:rPr>
-      <w:rFonts w:asciiTheme="majorHAnsi" w:eastAsiaTheme="majorEastAsia" w:hAnsiTheme="majorHAnsi" w:cstheme="majorBidi"/>
+      <w:rFonts w:asciiTheme="majorHAnsi" w:eastAsiaTheme="majorEastAsia" w:hAnsiTheme="majorHAnsi" w:cstheme="majorBidi" w:ascii="Liberation Sans" w:hAnsi="Liberation Sans"/>
       <w:b/>
       <w:color w:val="8B0000"/>
       <w:sz w:val="32"/>
@@ -893,7 +896,7 @@
       <w:outlineLvl w:val="2"/>
     </w:pPr>
     <w:rPr>
-      <w:rFonts w:eastAsiaTheme="majorEastAsia" w:cstheme="majorBidi"/>
+      <w:rFonts w:eastAsiaTheme="majorEastAsia" w:cstheme="majorBidi" w:ascii="Liberation Sans" w:hAnsi="Liberation Sans"/>
       <w:b/>
       <w:color w:val="8B0000"/>
       <w:sz w:val="26"/>
@@ -917,7 +920,7 @@
       <w:outlineLvl w:val="3"/>
     </w:pPr>
     <w:rPr>
-      <w:rFonts w:eastAsiaTheme="majorEastAsia" w:cstheme="majorBidi"/>
+      <w:rFonts w:eastAsiaTheme="majorEastAsia" w:cstheme="majorBidi" w:ascii="Liberation Sans" w:hAnsi="Liberation Sans"/>
       <w:b/>
       <w:i/>
       <w:iCs/>

</xml_diff>